<commit_message>
Rà soát bộ mẫu cấp 1–2: thống nhất dữ liệu mẫu giữa các văn bản, sửa trích TCVN nhật ký, ngày ký kế hoạch
Co-Authored-By: Claude Opus 5.5 <noreply@anthropic.com>
Claude-Session: https://claude.ai/code/session_01EYfrLZFALxho7iwpK7bTVa
</commit_message>
<xml_diff>
--- a/templates/08-bo-mau-cap-1-2/02-qd-phan-cong-anm.docx
+++ b/templates/08-bo-mau-cap-1-2/02-qd-phan-cong-anm.docx
@@ -1861,7 +1861,57 @@
           <w:sz w:val="26"/>
           <w:szCs w:val="26"/>
         </w:rPr>
-        <w:t xml:space="preserve"> thông báo vi phạm quy định về bảo vệ dữ liệu cá nhân chậm nhất 72 giờ kể từ khi phát hiện (khoản 1 Điều 23 Luật Bảo vệ dữ liệu cá nhân số 91/2025/QH15).</w:t>
+        <w:t xml:space="preserve"> thông báo vi phạm quy định về bảo vệ dữ liệu cá nhân chậm nhất 72 giờ kể từ khi phát hiện (khoản 1 Điều 23 Luật Bảo vệ dữ liệu cá nhân số 91/2025/QH15). Người chủ chốt (hoặc người dự phòng khi người chủ chốt vắng mặt) được ký thừa ủy quyền </w:t>
+      </w:r>
+      <w:r>
+        <w:rPr>
+          <w:rFonts w:ascii="Times New Roman" w:cs="Times New Roman" w:eastAsia="Times New Roman" w:hAnsi="Times New Roman"/>
+          <w:b w:val="false"/>
+          <w:bCs w:val="false"/>
+          <w:i w:val="false"/>
+          <w:iCs w:val="false"/>
+          <w:sz w:val="26"/>
+          <w:szCs w:val="26"/>
+          <w:highlight w:val="yellow"/>
+        </w:rPr>
+        <w:t xml:space="preserve">Tổng Giám đốc</w:t>
+      </w:r>
+      <w:r>
+        <w:rPr>
+          <w:rFonts w:ascii="Times New Roman" w:cs="Times New Roman" w:eastAsia="Times New Roman" w:hAnsi="Times New Roman"/>
+          <w:b w:val="false"/>
+          <w:bCs w:val="false"/>
+          <w:i w:val="false"/>
+          <w:iCs w:val="false"/>
+          <w:sz w:val="26"/>
+          <w:szCs w:val="26"/>
+        </w:rPr>
+        <w:t xml:space="preserve"> các báo cáo nhanh sự cố gửi cơ quan có thẩm quyền và báo cáo ngay cho </w:t>
+      </w:r>
+      <w:r>
+        <w:rPr>
+          <w:rFonts w:ascii="Times New Roman" w:cs="Times New Roman" w:eastAsia="Times New Roman" w:hAnsi="Times New Roman"/>
+          <w:b w:val="false"/>
+          <w:bCs w:val="false"/>
+          <w:i w:val="false"/>
+          <w:iCs w:val="false"/>
+          <w:sz w:val="26"/>
+          <w:szCs w:val="26"/>
+          <w:highlight w:val="yellow"/>
+        </w:rPr>
+        <w:t xml:space="preserve">Tổng Giám đốc</w:t>
+      </w:r>
+      <w:r>
+        <w:rPr>
+          <w:rFonts w:ascii="Times New Roman" w:cs="Times New Roman" w:eastAsia="Times New Roman" w:hAnsi="Times New Roman"/>
+          <w:b w:val="false"/>
+          <w:bCs w:val="false"/>
+          <w:i w:val="false"/>
+          <w:iCs w:val="false"/>
+          <w:sz w:val="26"/>
+          <w:szCs w:val="26"/>
+        </w:rPr>
+        <w:t xml:space="preserve"> sau khi gửi.</w:t>
       </w:r>
     </w:p>
     <w:p>
@@ -1962,7 +2012,7 @@
           <w:sz w:val="26"/>
           <w:szCs w:val="26"/>
         </w:rPr>
-        <w:t xml:space="preserve">2. Nhân sự vận hành, quản trị hệ thống và bảo vệ an ninh mạng phải ký cam kết bảo mật thông tin trong quá trình làm việc và sau khi nghỉ việc. </w:t>
+        <w:t xml:space="preserve">2. Nhân sự vận hành, quản trị hệ thống và bảo vệ an ninh mạng phải ký cam kết bảo mật thông tin, có hiệu lực cả trong thời gian làm việc và sau khi nghỉ việc. </w:t>
       </w:r>
       <w:r>
         <w:rPr>

</xml_diff>

<commit_message>
Rà soát C18: thẩm quyền, thời hạn, Đ18.4, Đ33.1 với thủ tục cấp độ 1–2
- Thẩm quyền phê duyệt cấp 1–2 do NĐ 331 giao trực tiếp (Đ18.1, Đ32.4): đơn vị
  chuyên trách ký nhân danh mình; QĐ phân công ghi người ký, số văn bản, việc dùng dấu
- Đ24.2 (07 ngày LV) áp dụng cả cấp 1–2: thẩm định + phê duyệt trong tổng 07 ngày
- Đ18.4: đơn vị/Hội đồng độc lập thẩm định, người đứng đầu ký phê duyệt
- Đ33.1: phương án phê duyệt theo Đ18.1 là phương án đã được chủ quản phê duyệt
- Cập nhật C18, tham-quyen-trinh-tu, mẫu 02, 03, 06, 07, README bộ cấp 1–2

Co-Authored-By: Claude Opus 5.5 <noreply@anthropic.com>
Claude-Session: https://claude.ai/code/session_01EYfrLZFALxho7iwpK7bTVa
</commit_message>
<xml_diff>
--- a/templates/08-bo-mau-cap-1-2/02-qd-phan-cong-anm.docx
+++ b/templates/08-bo-mau-cap-1-2/02-qd-phan-cong-anm.docx
@@ -692,7 +692,7 @@
           <w:szCs w:val="26"/>
           <w:highlight w:val="yellow"/>
         </w:rPr>
-        <w:t xml:space="preserve">10 ngày làm việc</w:t>
+        <w:t xml:space="preserve">05 ngày làm việc</w:t>
       </w:r>
       <w:r>
         <w:rPr>
@@ -723,7 +723,7 @@
           <w:sz w:val="26"/>
           <w:szCs w:val="26"/>
         </w:rPr>
-        <w:t xml:space="preserve">c) Phê duyệt đề xuất cấp độ đối với hệ thống thông tin được đề xuất cấp độ 1, cấp độ 2 theo khoản 1 Điều 18 và điểm a khoản 3 Điều 20 Nghị định số 331/2026/NĐ-CP;</w:t>
+        <w:t xml:space="preserve">c) Phê duyệt đề xuất cấp độ, bao gồm phương án bảo đảm an ninh mạng, đối với hệ thống thông tin được đề xuất cấp độ 1, cấp độ 2 theo khoản 1 Điều 18, điểm a khoản 3 Điều 20 và khoản 4 Điều 32 Nghị định số 331/2026/NĐ-CP; việc thẩm định và phê duyệt hoàn thành trong thời hạn tối đa 07 ngày làm việc kể từ ngày nhận đủ hồ sơ hợp lệ (khoản 2 Điều 24 Nghị định số 331/2026/NĐ-CP);</w:t>
       </w:r>
     </w:p>
     <w:p>
@@ -943,6 +943,31 @@
           <w:sz w:val="26"/>
           <w:szCs w:val="26"/>
         </w:rPr>
+        <w:t xml:space="preserve">; việc sử dụng dấu đối với các văn bản này: </w:t>
+      </w:r>
+      <w:r>
+        <w:rPr>
+          <w:rFonts w:ascii="Times New Roman" w:cs="Times New Roman" w:eastAsia="Times New Roman" w:hAnsi="Times New Roman"/>
+          <w:b w:val="false"/>
+          <w:bCs w:val="false"/>
+          <w:i w:val="false"/>
+          <w:iCs w:val="false"/>
+          <w:sz w:val="26"/>
+          <w:szCs w:val="26"/>
+          <w:highlight w:val="yellow"/>
+        </w:rPr>
+        <w:t xml:space="preserve">không đóng dấu; đăng ký số và lưu tại văn thư Công ty</w:t>
+      </w:r>
+      <w:r>
+        <w:rPr>
+          <w:rFonts w:ascii="Times New Roman" w:cs="Times New Roman" w:eastAsia="Times New Roman" w:hAnsi="Times New Roman"/>
+          <w:b w:val="false"/>
+          <w:bCs w:val="false"/>
+          <w:i w:val="false"/>
+          <w:iCs w:val="false"/>
+          <w:sz w:val="26"/>
+          <w:szCs w:val="26"/>
+        </w:rPr>
         <w:t xml:space="preserve">.</w:t>
       </w:r>
     </w:p>
@@ -1017,6 +1042,25 @@
     </w:p>
     <w:p>
       <w:pPr>
+        <w:spacing w:after="60" w:before="0" w:line="276" w:lineRule="auto"/>
+        <w:ind w:left="453" w:hanging="283"/>
+        <w:jc w:val="both"/>
+      </w:pPr>
+      <w:r>
+        <w:rPr>
+          <w:rFonts w:ascii="Times New Roman" w:cs="Times New Roman" w:eastAsia="Times New Roman" w:hAnsi="Times New Roman"/>
+          <w:b w:val="false"/>
+          <w:bCs w:val="false"/>
+          <w:i w:val="false"/>
+          <w:iCs w:val="false"/>
+          <w:sz w:val="26"/>
+          <w:szCs w:val="26"/>
+        </w:rPr>
+        <w:t xml:space="preserve">5. Phương án bảo đảm an ninh mạng được phê duyệt tại quyết định phê duyệt cấp độ theo khoản 1 Điều 18 Nghị định số 331/2026/NĐ-CP là phương án đã được chủ quản hệ thống thông tin phê duyệt để thực hiện khoản 1 Điều 33 Nghị định số 331/2026/NĐ-CP.</w:t>
+      </w:r>
+    </w:p>
+    <w:p>
+      <w:pPr>
         <w:spacing w:after="120" w:before="0" w:line="276" w:lineRule="auto"/>
         <w:ind w:firstLine="566"/>
         <w:jc w:val="both"/>
@@ -1597,7 +1641,76 @@
           <w:sz w:val="26"/>
           <w:szCs w:val="26"/>
         </w:rPr>
-        <w:t xml:space="preserve">2. Tình trạng tại thời điểm ban hành Quyết định này: </w:t>
+        <w:t xml:space="preserve">2. Trong trường hợp quy định tại khoản 1 Điều này, </w:t>
+      </w:r>
+      <w:r>
+        <w:rPr>
+          <w:rFonts w:ascii="Times New Roman" w:cs="Times New Roman" w:eastAsia="Times New Roman" w:hAnsi="Times New Roman"/>
+          <w:b w:val="false"/>
+          <w:bCs w:val="false"/>
+          <w:i w:val="false"/>
+          <w:iCs w:val="false"/>
+          <w:sz w:val="26"/>
+          <w:szCs w:val="26"/>
+          <w:highlight w:val="yellow"/>
+        </w:rPr>
+        <w:t xml:space="preserve">Tổng Giám đốc</w:t>
+      </w:r>
+      <w:r>
+        <w:rPr>
+          <w:rFonts w:ascii="Times New Roman" w:cs="Times New Roman" w:eastAsia="Times New Roman" w:hAnsi="Times New Roman"/>
+          <w:b w:val="false"/>
+          <w:bCs w:val="false"/>
+          <w:i w:val="false"/>
+          <w:iCs w:val="false"/>
+          <w:sz w:val="26"/>
+          <w:szCs w:val="26"/>
+        </w:rPr>
+        <w:t xml:space="preserve"> trực tiếp ký quyết định phê duyệt cấp độ trên cơ sở kết quả thẩm định độc lập; </w:t>
+      </w:r>
+      <w:r>
+        <w:rPr>
+          <w:rFonts w:ascii="Times New Roman" w:cs="Times New Roman" w:eastAsia="Times New Roman" w:hAnsi="Times New Roman"/>
+          <w:b w:val="false"/>
+          <w:bCs w:val="false"/>
+          <w:i w:val="false"/>
+          <w:iCs w:val="false"/>
+          <w:sz w:val="26"/>
+          <w:szCs w:val="26"/>
+          <w:highlight w:val="yellow"/>
+        </w:rPr>
+        <w:t xml:space="preserve">Phòng An ninh mạng</w:t>
+      </w:r>
+      <w:r>
+        <w:rPr>
+          <w:rFonts w:ascii="Times New Roman" w:cs="Times New Roman" w:eastAsia="Times New Roman" w:hAnsi="Times New Roman"/>
+          <w:b w:val="false"/>
+          <w:bCs w:val="false"/>
+          <w:i w:val="false"/>
+          <w:iCs w:val="false"/>
+          <w:sz w:val="26"/>
+          <w:szCs w:val="26"/>
+        </w:rPr>
+        <w:t xml:space="preserve"> trình dự thảo quyết định kèm biên bản thẩm định.</w:t>
+      </w:r>
+    </w:p>
+    <w:p>
+      <w:pPr>
+        <w:spacing w:after="60" w:before="0" w:line="276" w:lineRule="auto"/>
+        <w:ind w:left="453" w:hanging="283"/>
+        <w:jc w:val="both"/>
+      </w:pPr>
+      <w:r>
+        <w:rPr>
+          <w:rFonts w:ascii="Times New Roman" w:cs="Times New Roman" w:eastAsia="Times New Roman" w:hAnsi="Times New Roman"/>
+          <w:b w:val="false"/>
+          <w:bCs w:val="false"/>
+          <w:i w:val="false"/>
+          <w:iCs w:val="false"/>
+          <w:sz w:val="26"/>
+          <w:szCs w:val="26"/>
+        </w:rPr>
+        <w:t xml:space="preserve">3. Tình trạng tại thời điểm ban hành Quyết định này: </w:t>
       </w:r>
       <w:r>
         <w:rPr>

</xml_diff>